<commit_message>
Endelig leveranse v2 — komplett prosjektrapport + sluttrapport + opprydning
Hovedleveranser:
- 05 - Endelig innlevering/Komplett prosjektrapport - Nye Hædda Barneskole.pdf
  35 sider, APA7-stil, 10 figurer, 8 kapitler + referanser + vedlegg
- 04 - Avslutning/Sluttrapport - Nye Hædda Barneskole.pdf
  13 sider, utvidet versjon med fokus på fase 4

Konsistens-fikser overalt:
- "Gruppe 4.5 — irgesundinger" → "Gruppe 4.5"
- "NHB-IRGESUND" → "NHB-2026-15" (saksnummer uten Bårds filsuffiks)
- Tekstoverlapp i tabeller fikset via Paragraph-wrapping i make_table()

Alle dokumenter regenerert:
- 16 månedsrapporter (docx + pdf) med oppdatert gruppenavn + saksnummer
- 2 endringsdokumenter (NHB-2026-15 og CR-001) regenerert
- 00 - Les meg først.pdf oppdatert
- Status-PDF for senkveld lagt til
</commit_message>
<xml_diff>
--- a/03 - Gjennomføring/Endringsdokumenter/Endringsdokument CR-001 - Sprinkler-romning.docx
+++ b/03 - Gjennomføring/Endringsdokumenter/Endringsdokument CR-001 - Sprinkler-romning.docx
@@ -1925,7 +1925,7 @@
               <w:spacing w:before="40" w:after="40"/>
             </w:pPr>
             <w:r>
-              <w:t>Prosjektleder (gruppe irgesundinger)</w:t>
+              <w:t>Prosjektleder (Gruppe 4.5)</w:t>
             </w:r>
           </w:p>
         </w:tc>
@@ -2308,7 +2308,7 @@
               <w:spacing w:before="40" w:after="40"/>
             </w:pPr>
             <w:r>
-              <w:t>Prosjektleder, gruppe irgesundinger</w:t>
+              <w:t>Prosjektleder, Gruppe 4.5</w:t>
             </w:r>
           </w:p>
         </w:tc>

</xml_diff>